<commit_message>
Update BaoCao.docx và sửa lỗi main.py
</commit_message>
<xml_diff>
--- a/DOCX/BaoCao.docx
+++ b/DOCX/BaoCao.docx
@@ -4072,7 +4072,29 @@
           <w:szCs w:val="26"/>
           <w:lang w:val="en-US"/>
         </w:rPr>
-        <w:t>Và trong đề tài này, trò chơi được phát triển thành Sudoku đối kháng -  một phiên bản nhiều người chơi (Player versus Player - PvP) trực tuyến hoặc trực tiếp của trò chơi giải đố điền số cổ điển, nơi hai hay nhiều người cùng giải một bảng số hoặc thi đấu tốc độ, chính xác để tìm ra người chiến thắng.</w:t>
+        <w:t xml:space="preserve">Và trong đề tài này, trò chơi được phát triển thành Sudoku đối kháng </w:t>
+      </w:r>
+      <w:proofErr w:type="gramStart"/>
+      <w:r>
+        <w:rPr>
+          <w:rFonts w:ascii="Times New Roman" w:eastAsia="Times New Roman" w:hAnsi="Times New Roman" w:cs="Times New Roman"/>
+          <w:color w:val="000000"/>
+          <w:sz w:val="26"/>
+          <w:szCs w:val="26"/>
+          <w:lang w:val="en-US"/>
+        </w:rPr>
+        <w:t>-  một</w:t>
+      </w:r>
+      <w:proofErr w:type="gramEnd"/>
+      <w:r>
+        <w:rPr>
+          <w:rFonts w:ascii="Times New Roman" w:eastAsia="Times New Roman" w:hAnsi="Times New Roman" w:cs="Times New Roman"/>
+          <w:color w:val="000000"/>
+          <w:sz w:val="26"/>
+          <w:szCs w:val="26"/>
+          <w:lang w:val="en-US"/>
+        </w:rPr>
+        <w:t xml:space="preserve"> phiên bản nhiều người chơi (Player versus Player - PvP) trực tuyến hoặc trực tiếp của trò chơi giải đố điền số cổ điển, nơi hai hay nhiều người cùng giải một bảng số hoặc thi đấu tốc độ, chính xác để tìm ra người chiến thắng.</w:t>
       </w:r>
     </w:p>
     <w:p>
@@ -5451,7 +5473,25 @@
           <w:szCs w:val="26"/>
         </w:rPr>
         <w:lastRenderedPageBreak/>
-        <w:t>Trước khi đặt một số vào ô trống, chương trình cần xác định số đó có hợp lệ hay không. Chức năng này được thực hiện bởi hàm valid(board, r, c, n). Hàm nhận bàn cờ, vị trí hàng r, cột c và số n cần thử.</w:t>
+        <w:t xml:space="preserve">Trước khi đặt một số vào ô trống, chương trình cần xác định số đó có hợp lệ hay không. Chức năng này được thực hiện bởi hàm </w:t>
+      </w:r>
+      <w:proofErr w:type="gramStart"/>
+      <w:r>
+        <w:rPr>
+          <w:color w:val="000000"/>
+          <w:sz w:val="26"/>
+          <w:szCs w:val="26"/>
+        </w:rPr>
+        <w:t>valid(</w:t>
+      </w:r>
+      <w:proofErr w:type="gramEnd"/>
+      <w:r>
+        <w:rPr>
+          <w:color w:val="000000"/>
+          <w:sz w:val="26"/>
+          <w:szCs w:val="26"/>
+        </w:rPr>
+        <w:t>board, r, c, n). Hàm nhận bàn cờ, vị trí hàng r, cột c và số n cần thử.</w:t>
       </w:r>
     </w:p>
     <w:p>
@@ -5487,8 +5527,9 @@
           <w:sz w:val="19"/>
           <w:szCs w:val="19"/>
         </w:rPr>
-        <w:t>def valid(board, r, c, n):</w:t>
-      </w:r>
+        <w:t xml:space="preserve">def </w:t>
+      </w:r>
+      <w:proofErr w:type="gramStart"/>
       <w:r>
         <w:rPr>
           <w:rFonts w:ascii="Courier New" w:hAnsi="Courier New" w:cs="Courier New"/>
@@ -5496,6 +5537,25 @@
           <w:sz w:val="19"/>
           <w:szCs w:val="19"/>
         </w:rPr>
+        <w:t>valid(</w:t>
+      </w:r>
+      <w:proofErr w:type="gramEnd"/>
+      <w:r>
+        <w:rPr>
+          <w:rFonts w:ascii="Courier New" w:hAnsi="Courier New" w:cs="Courier New"/>
+          <w:color w:val="000000"/>
+          <w:sz w:val="19"/>
+          <w:szCs w:val="19"/>
+        </w:rPr>
+        <w:t>board, r, c, n):</w:t>
+      </w:r>
+      <w:r>
+        <w:rPr>
+          <w:rFonts w:ascii="Courier New" w:hAnsi="Courier New" w:cs="Courier New"/>
+          <w:color w:val="000000"/>
+          <w:sz w:val="19"/>
+          <w:szCs w:val="19"/>
+        </w:rPr>
         <w:br/>
         <w:t>if n in board[r]:</w:t>
       </w:r>
@@ -5526,8 +5586,9 @@
           <w:szCs w:val="19"/>
         </w:rPr>
         <w:br/>
-        <w:t>if any(board[i][c] == n for i in range(9)):</w:t>
-      </w:r>
+        <w:t xml:space="preserve">if any(board[i][c] == n for i in </w:t>
+      </w:r>
+      <w:proofErr w:type="gramStart"/>
       <w:r>
         <w:rPr>
           <w:rFonts w:ascii="Courier New" w:hAnsi="Courier New" w:cs="Courier New"/>
@@ -5535,6 +5596,25 @@
           <w:sz w:val="19"/>
           <w:szCs w:val="19"/>
         </w:rPr>
+        <w:t>range(</w:t>
+      </w:r>
+      <w:proofErr w:type="gramEnd"/>
+      <w:r>
+        <w:rPr>
+          <w:rFonts w:ascii="Courier New" w:hAnsi="Courier New" w:cs="Courier New"/>
+          <w:color w:val="000000"/>
+          <w:sz w:val="19"/>
+          <w:szCs w:val="19"/>
+        </w:rPr>
+        <w:t>9)):</w:t>
+      </w:r>
+      <w:r>
+        <w:rPr>
+          <w:rFonts w:ascii="Courier New" w:hAnsi="Courier New" w:cs="Courier New"/>
+          <w:color w:val="000000"/>
+          <w:sz w:val="19"/>
+          <w:szCs w:val="19"/>
+        </w:rPr>
         <w:br/>
         <w:t>return False</w:t>
       </w:r>
@@ -5584,8 +5664,9 @@
           <w:szCs w:val="19"/>
         </w:rPr>
         <w:br/>
-        <w:t>for i in range(br, br + 3):</w:t>
-      </w:r>
+        <w:t xml:space="preserve">for i in </w:t>
+      </w:r>
+      <w:proofErr w:type="gramStart"/>
       <w:r>
         <w:rPr>
           <w:rFonts w:ascii="Courier New" w:hAnsi="Courier New" w:cs="Courier New"/>
@@ -5593,8 +5674,47 @@
           <w:sz w:val="19"/>
           <w:szCs w:val="19"/>
         </w:rPr>
+        <w:t>range(</w:t>
+      </w:r>
+      <w:proofErr w:type="gramEnd"/>
+      <w:r>
+        <w:rPr>
+          <w:rFonts w:ascii="Courier New" w:hAnsi="Courier New" w:cs="Courier New"/>
+          <w:color w:val="000000"/>
+          <w:sz w:val="19"/>
+          <w:szCs w:val="19"/>
+        </w:rPr>
+        <w:t>br, br + 3):</w:t>
+      </w:r>
+      <w:r>
+        <w:rPr>
+          <w:rFonts w:ascii="Courier New" w:hAnsi="Courier New" w:cs="Courier New"/>
+          <w:color w:val="000000"/>
+          <w:sz w:val="19"/>
+          <w:szCs w:val="19"/>
+        </w:rPr>
         <w:br/>
-        <w:t>for j in range(bc, bc + 3):</w:t>
+        <w:t xml:space="preserve">for j in </w:t>
+      </w:r>
+      <w:proofErr w:type="gramStart"/>
+      <w:r>
+        <w:rPr>
+          <w:rFonts w:ascii="Courier New" w:hAnsi="Courier New" w:cs="Courier New"/>
+          <w:color w:val="000000"/>
+          <w:sz w:val="19"/>
+          <w:szCs w:val="19"/>
+        </w:rPr>
+        <w:t>range(</w:t>
+      </w:r>
+      <w:proofErr w:type="gramEnd"/>
+      <w:r>
+        <w:rPr>
+          <w:rFonts w:ascii="Courier New" w:hAnsi="Courier New" w:cs="Courier New"/>
+          <w:color w:val="000000"/>
+          <w:sz w:val="19"/>
+          <w:szCs w:val="19"/>
+        </w:rPr>
+        <w:t>bc, bc + 3):</w:t>
       </w:r>
       <w:r>
         <w:rPr>
@@ -5680,13 +5800,15 @@
           <w:color w:val="000000"/>
           <w:sz w:val="26"/>
           <w:szCs w:val="26"/>
-        </w:rPr>
-      </w:pPr>
-      <w:r>
-        <w:rPr>
-          <w:color w:val="000000"/>
-          <w:sz w:val="26"/>
-          <w:szCs w:val="26"/>
+          <w:lang w:val="vi-VN"/>
+        </w:rPr>
+      </w:pPr>
+      <w:r>
+        <w:rPr>
+          <w:color w:val="000000"/>
+          <w:sz w:val="26"/>
+          <w:szCs w:val="26"/>
+          <w:lang w:val="vi-VN"/>
         </w:rPr>
         <w:t>Tiếp theo, chương trình kiểm tra cột. Biểu thức any(board[i][c] == n for i in range(9)) duyệt qua toàn bộ 9 hàng tại cột c. Nếu phát hiện số n đã có trong cột, hàm cũng trả về False.</w:t>
       </w:r>
@@ -5700,13 +5822,15 @@
           <w:color w:val="000000"/>
           <w:sz w:val="26"/>
           <w:szCs w:val="26"/>
-        </w:rPr>
-      </w:pPr>
-      <w:r>
-        <w:rPr>
-          <w:color w:val="000000"/>
-          <w:sz w:val="26"/>
-          <w:szCs w:val="26"/>
+          <w:lang w:val="vi-VN"/>
+        </w:rPr>
+      </w:pPr>
+      <w:r>
+        <w:rPr>
+          <w:color w:val="000000"/>
+          <w:sz w:val="26"/>
+          <w:szCs w:val="26"/>
+          <w:lang w:val="vi-VN"/>
         </w:rPr>
         <w:t>Cuối cùng, chương trình kiểm tra khối 3×3. Hai biến br và bc xác định vị trí góc trên bên trái của khối 3×3 chứa ô đang xét. Hai vòng lặp for tiếp tục duyệt 9 ô trong khối đó.</w:t>
       </w:r>
@@ -5720,13 +5844,15 @@
           <w:color w:val="000000"/>
           <w:sz w:val="26"/>
           <w:szCs w:val="26"/>
-        </w:rPr>
-      </w:pPr>
-      <w:r>
-        <w:rPr>
-          <w:color w:val="000000"/>
-          <w:sz w:val="26"/>
-          <w:szCs w:val="26"/>
+          <w:lang w:val="vi-VN"/>
+        </w:rPr>
+      </w:pPr>
+      <w:r>
+        <w:rPr>
+          <w:color w:val="000000"/>
+          <w:sz w:val="26"/>
+          <w:szCs w:val="26"/>
+          <w:lang w:val="vi-VN"/>
         </w:rPr>
         <w:t>Nếu số n không xuất hiện trong hàng, cột và khối 3×3 thì hàm trả về True. Điều này có nghĩa số n có thể được đặt vào vị trí đang xét mà vẫn đảm bảo các luật cơ bản của Sudoku.</w:t>
       </w:r>
@@ -5740,13 +5866,15 @@
           <w:color w:val="000000"/>
           <w:sz w:val="26"/>
           <w:szCs w:val="26"/>
-        </w:rPr>
-      </w:pPr>
-      <w:r>
-        <w:rPr>
-          <w:color w:val="000000"/>
-          <w:sz w:val="26"/>
-          <w:szCs w:val="26"/>
+          <w:lang w:val="vi-VN"/>
+        </w:rPr>
+      </w:pPr>
+      <w:r>
+        <w:rPr>
+          <w:color w:val="000000"/>
+          <w:sz w:val="26"/>
+          <w:szCs w:val="26"/>
+          <w:lang w:val="vi-VN"/>
         </w:rPr>
         <w:t>Hàm valid() có vai trò như một bộ lọc cho Backtracking. Nhờ kiểm tra trước mỗi lần đặt số, thuật toán tránh được nhiều trường hợp sai và giảm số nhánh phải tìm kiếm.</w:t>
       </w:r>
@@ -5818,7 +5946,27 @@
           <w:sz w:val="26"/>
           <w:szCs w:val="26"/>
         </w:rPr>
-        <w:t>Trong bài toán Sudoku, chương trình tìm một ô trống, thử lần lượt các số từ 1 đến 9, kiểm tra từng số bằng hàm valid(). Nếu số phù hợp, số đó được đặt vào ô và thuật toán tiếp tục xử lý các ô còn lại bằng lời gọi đệ quy.</w:t>
+        <w:t xml:space="preserve">Trong bài toán Sudoku, chương trình tìm một ô trống, thử lần lượt các số từ 1 đến 9, kiểm tra từng số bằng hàm </w:t>
+      </w:r>
+      <w:proofErr w:type="gramStart"/>
+      <w:r>
+        <w:rPr>
+          <w:rFonts w:ascii="Times New Roman" w:eastAsia="Times New Roman" w:hAnsi="Times New Roman" w:cs="Times New Roman"/>
+          <w:color w:val="000000"/>
+          <w:sz w:val="26"/>
+          <w:szCs w:val="26"/>
+        </w:rPr>
+        <w:t>valid(</w:t>
+      </w:r>
+      <w:proofErr w:type="gramEnd"/>
+      <w:r>
+        <w:rPr>
+          <w:rFonts w:ascii="Times New Roman" w:eastAsia="Times New Roman" w:hAnsi="Times New Roman" w:cs="Times New Roman"/>
+          <w:color w:val="000000"/>
+          <w:sz w:val="26"/>
+          <w:szCs w:val="26"/>
+        </w:rPr>
+        <w:t>). Nếu số phù hợp, số đó được đặt vào ô và thuật toán tiếp tục xử lý các ô còn lại bằng lời gọi đệ quy.</w:t>
       </w:r>
     </w:p>
     <w:p>
@@ -5861,8 +6009,9 @@
           <w:szCs w:val="19"/>
         </w:rPr>
         <w:br/>
-        <w:t>for r in range(9):</w:t>
-      </w:r>
+        <w:t xml:space="preserve">for r in </w:t>
+      </w:r>
+      <w:proofErr w:type="gramStart"/>
       <w:r>
         <w:rPr>
           <w:rFonts w:ascii="Courier New" w:eastAsia="Times New Roman" w:hAnsi="Courier New" w:cs="Courier New"/>
@@ -5870,9 +6019,9 @@
           <w:sz w:val="19"/>
           <w:szCs w:val="19"/>
         </w:rPr>
-        <w:br/>
-        <w:t>for c in range(9):</w:t>
-      </w:r>
+        <w:t>range(</w:t>
+      </w:r>
+      <w:proofErr w:type="gramEnd"/>
       <w:r>
         <w:rPr>
           <w:rFonts w:ascii="Courier New" w:eastAsia="Times New Roman" w:hAnsi="Courier New" w:cs="Courier New"/>
@@ -5880,7 +6029,7 @@
           <w:sz w:val="19"/>
           <w:szCs w:val="19"/>
         </w:rPr>
-        <w:br/>
+        <w:t>9):</w:t>
       </w:r>
       <w:r>
         <w:rPr>
@@ -5889,6 +6038,45 @@
           <w:sz w:val="19"/>
           <w:szCs w:val="19"/>
         </w:rPr>
+        <w:br/>
+        <w:t xml:space="preserve">for c in </w:t>
+      </w:r>
+      <w:proofErr w:type="gramStart"/>
+      <w:r>
+        <w:rPr>
+          <w:rFonts w:ascii="Courier New" w:eastAsia="Times New Roman" w:hAnsi="Courier New" w:cs="Courier New"/>
+          <w:color w:val="000000"/>
+          <w:sz w:val="19"/>
+          <w:szCs w:val="19"/>
+        </w:rPr>
+        <w:t>range(</w:t>
+      </w:r>
+      <w:proofErr w:type="gramEnd"/>
+      <w:r>
+        <w:rPr>
+          <w:rFonts w:ascii="Courier New" w:eastAsia="Times New Roman" w:hAnsi="Courier New" w:cs="Courier New"/>
+          <w:color w:val="000000"/>
+          <w:sz w:val="19"/>
+          <w:szCs w:val="19"/>
+        </w:rPr>
+        <w:t>9):</w:t>
+      </w:r>
+      <w:r>
+        <w:rPr>
+          <w:rFonts w:ascii="Courier New" w:eastAsia="Times New Roman" w:hAnsi="Courier New" w:cs="Courier New"/>
+          <w:color w:val="000000"/>
+          <w:sz w:val="19"/>
+          <w:szCs w:val="19"/>
+        </w:rPr>
+        <w:br/>
+      </w:r>
+      <w:r>
+        <w:rPr>
+          <w:rFonts w:ascii="Courier New" w:eastAsia="Times New Roman" w:hAnsi="Courier New" w:cs="Courier New"/>
+          <w:color w:val="000000"/>
+          <w:sz w:val="19"/>
+          <w:szCs w:val="19"/>
+        </w:rPr>
         <w:lastRenderedPageBreak/>
         <w:t>if board[r][c] == 0:</w:t>
       </w:r>
@@ -5900,8 +6088,9 @@
           <w:szCs w:val="19"/>
         </w:rPr>
         <w:br/>
-        <w:t>nums = list(range(1, 10))</w:t>
-      </w:r>
+        <w:t xml:space="preserve">nums = </w:t>
+      </w:r>
+      <w:proofErr w:type="gramStart"/>
       <w:r>
         <w:rPr>
           <w:rFonts w:ascii="Courier New" w:eastAsia="Times New Roman" w:hAnsi="Courier New" w:cs="Courier New"/>
@@ -5909,9 +6098,9 @@
           <w:sz w:val="19"/>
           <w:szCs w:val="19"/>
         </w:rPr>
-        <w:br/>
-        <w:t>random.shuffle(nums)</w:t>
-      </w:r>
+        <w:t>list(range(</w:t>
+      </w:r>
+      <w:proofErr w:type="gramEnd"/>
       <w:r>
         <w:rPr>
           <w:rFonts w:ascii="Courier New" w:eastAsia="Times New Roman" w:hAnsi="Courier New" w:cs="Courier New"/>
@@ -5919,7 +6108,7 @@
           <w:sz w:val="19"/>
           <w:szCs w:val="19"/>
         </w:rPr>
-        <w:br/>
+        <w:t>1, 10))</w:t>
       </w:r>
       <w:r>
         <w:rPr>
@@ -5929,8 +6118,8 @@
           <w:szCs w:val="19"/>
         </w:rPr>
         <w:br/>
-        <w:t>for n in nums:</w:t>
-      </w:r>
+      </w:r>
+      <w:proofErr w:type="gramStart"/>
       <w:r>
         <w:rPr>
           <w:rFonts w:ascii="Courier New" w:eastAsia="Times New Roman" w:hAnsi="Courier New" w:cs="Courier New"/>
@@ -5938,9 +6127,9 @@
           <w:sz w:val="19"/>
           <w:szCs w:val="19"/>
         </w:rPr>
-        <w:br/>
-        <w:t>if valid(board, r, c, n):</w:t>
-      </w:r>
+        <w:t>random.shuffle</w:t>
+      </w:r>
+      <w:proofErr w:type="gramEnd"/>
       <w:r>
         <w:rPr>
           <w:rFonts w:ascii="Courier New" w:eastAsia="Times New Roman" w:hAnsi="Courier New" w:cs="Courier New"/>
@@ -5948,6 +6137,64 @@
           <w:sz w:val="19"/>
           <w:szCs w:val="19"/>
         </w:rPr>
+        <w:t>(nums)</w:t>
+      </w:r>
+      <w:r>
+        <w:rPr>
+          <w:rFonts w:ascii="Courier New" w:eastAsia="Times New Roman" w:hAnsi="Courier New" w:cs="Courier New"/>
+          <w:color w:val="000000"/>
+          <w:sz w:val="19"/>
+          <w:szCs w:val="19"/>
+        </w:rPr>
+        <w:br/>
+      </w:r>
+      <w:r>
+        <w:rPr>
+          <w:rFonts w:ascii="Courier New" w:eastAsia="Times New Roman" w:hAnsi="Courier New" w:cs="Courier New"/>
+          <w:color w:val="000000"/>
+          <w:sz w:val="19"/>
+          <w:szCs w:val="19"/>
+        </w:rPr>
+        <w:br/>
+        <w:t>for n in nums:</w:t>
+      </w:r>
+      <w:r>
+        <w:rPr>
+          <w:rFonts w:ascii="Courier New" w:eastAsia="Times New Roman" w:hAnsi="Courier New" w:cs="Courier New"/>
+          <w:color w:val="000000"/>
+          <w:sz w:val="19"/>
+          <w:szCs w:val="19"/>
+        </w:rPr>
+        <w:br/>
+        <w:t xml:space="preserve">if </w:t>
+      </w:r>
+      <w:proofErr w:type="gramStart"/>
+      <w:r>
+        <w:rPr>
+          <w:rFonts w:ascii="Courier New" w:eastAsia="Times New Roman" w:hAnsi="Courier New" w:cs="Courier New"/>
+          <w:color w:val="000000"/>
+          <w:sz w:val="19"/>
+          <w:szCs w:val="19"/>
+        </w:rPr>
+        <w:t>valid(</w:t>
+      </w:r>
+      <w:proofErr w:type="gramEnd"/>
+      <w:r>
+        <w:rPr>
+          <w:rFonts w:ascii="Courier New" w:eastAsia="Times New Roman" w:hAnsi="Courier New" w:cs="Courier New"/>
+          <w:color w:val="000000"/>
+          <w:sz w:val="19"/>
+          <w:szCs w:val="19"/>
+        </w:rPr>
+        <w:t>board, r, c, n):</w:t>
+      </w:r>
+      <w:r>
+        <w:rPr>
+          <w:rFonts w:ascii="Courier New" w:eastAsia="Times New Roman" w:hAnsi="Courier New" w:cs="Courier New"/>
+          <w:color w:val="000000"/>
+          <w:sz w:val="19"/>
+          <w:szCs w:val="19"/>
+        </w:rPr>
         <w:br/>
         <w:t>board[r][c] = n</w:t>
       </w:r>
@@ -6058,6 +6305,7 @@
           <w:color w:val="000000"/>
           <w:sz w:val="26"/>
           <w:szCs w:val="26"/>
+          <w:lang w:val="vi-VN"/>
         </w:rPr>
       </w:pPr>
       <w:r>
@@ -6066,6 +6314,7 @@
           <w:color w:val="000000"/>
           <w:sz w:val="26"/>
           <w:szCs w:val="26"/>
+          <w:lang w:val="vi-VN"/>
         </w:rPr>
         <w:t>Hai vòng lặp đầu tiên duyệt qua 9 hàng và 9 cột để tìm ô có giá trị 0. Khi tìm thấy ô trống, chương trình tạo danh sách các số từ 1 đến 9.</w:t>
       </w:r>
@@ -6078,6 +6327,7 @@
           <w:color w:val="000000"/>
           <w:sz w:val="26"/>
           <w:szCs w:val="26"/>
+          <w:lang w:val="vi-VN"/>
         </w:rPr>
       </w:pPr>
       <w:r>
@@ -6086,6 +6336,7 @@
           <w:color w:val="000000"/>
           <w:sz w:val="26"/>
           <w:szCs w:val="26"/>
+          <w:lang w:val="vi-VN"/>
         </w:rPr>
         <w:t>Hàm random.shuffle(nums) được sử dụng để thay đổi thứ tự thử các số. Điều này làm cho quá trình sinh Sudoku có tính ngẫu nhiên. Nếu không xáo trộn, chương trình có xu hướng thử số theo cùng một thứ tự.</w:t>
       </w:r>
@@ -6098,6 +6349,7 @@
           <w:color w:val="000000"/>
           <w:sz w:val="26"/>
           <w:szCs w:val="26"/>
+          <w:lang w:val="vi-VN"/>
         </w:rPr>
       </w:pPr>
       <w:r>
@@ -6106,6 +6358,7 @@
           <w:color w:val="000000"/>
           <w:sz w:val="26"/>
           <w:szCs w:val="26"/>
+          <w:lang w:val="vi-VN"/>
         </w:rPr>
         <w:t>Sau đó chương trình duyệt qua từng số trong nums. Với mỗi số, hàm valid() được gọi. Nếu số hợp lệ, chương trình đặt số đó vào ô bằng câu lệnh board[r][c] = n.</w:t>
       </w:r>
@@ -6309,7 +6562,27 @@
           <w:szCs w:val="19"/>
         </w:rPr>
         <w:br/>
-        <w:t>board = [[0 for _ in range(9)] for _ in range(9)]</w:t>
+        <w:t xml:space="preserve">board = [[0 for _ in </w:t>
+      </w:r>
+      <w:proofErr w:type="gramStart"/>
+      <w:r>
+        <w:rPr>
+          <w:rFonts w:ascii="Courier New" w:eastAsia="Times New Roman" w:hAnsi="Courier New" w:cs="Courier New"/>
+          <w:color w:val="000000"/>
+          <w:sz w:val="19"/>
+          <w:szCs w:val="19"/>
+        </w:rPr>
+        <w:t>range(</w:t>
+      </w:r>
+      <w:proofErr w:type="gramEnd"/>
+      <w:r>
+        <w:rPr>
+          <w:rFonts w:ascii="Courier New" w:eastAsia="Times New Roman" w:hAnsi="Courier New" w:cs="Courier New"/>
+          <w:color w:val="000000"/>
+          <w:sz w:val="19"/>
+          <w:szCs w:val="19"/>
+        </w:rPr>
+        <w:t>9)] for _ in range(9)]</w:t>
       </w:r>
       <w:r>
         <w:rPr>
@@ -6505,6 +6778,7 @@
           <w:color w:val="000000"/>
           <w:sz w:val="26"/>
           <w:szCs w:val="26"/>
+          <w:lang w:val="vi-VN"/>
         </w:rPr>
         <w:t>Chương trình tiếp tục tạo danh sách toàn bộ tọa độ của bàn cờ. Mỗi tọa độ được lưu dưới dạng (r, c), trong đó r là hàng và c là cột.</w:t>
       </w:r>
@@ -6558,8 +6832,9 @@
           <w:szCs w:val="19"/>
         </w:rPr>
         <w:br/>
-        <w:t>for r in range(9):</w:t>
-      </w:r>
+        <w:t xml:space="preserve">for r in </w:t>
+      </w:r>
+      <w:proofErr w:type="gramStart"/>
       <w:r>
         <w:rPr>
           <w:rFonts w:ascii="Courier New" w:eastAsia="Times New Roman" w:hAnsi="Courier New" w:cs="Courier New"/>
@@ -6567,9 +6842,9 @@
           <w:sz w:val="19"/>
           <w:szCs w:val="19"/>
         </w:rPr>
-        <w:br/>
-        <w:t>for c in range(9):</w:t>
-      </w:r>
+        <w:t>range(</w:t>
+      </w:r>
+      <w:proofErr w:type="gramEnd"/>
       <w:r>
         <w:rPr>
           <w:rFonts w:ascii="Courier New" w:eastAsia="Times New Roman" w:hAnsi="Courier New" w:cs="Courier New"/>
@@ -6577,8 +6852,7 @@
           <w:sz w:val="19"/>
           <w:szCs w:val="19"/>
         </w:rPr>
-        <w:br/>
-        <w:t>positions.append((r, c))</w:t>
+        <w:t>9):</w:t>
       </w:r>
       <w:r>
         <w:rPr>
@@ -6588,7 +6862,9 @@
           <w:szCs w:val="19"/>
         </w:rPr>
         <w:br/>
-      </w:r>
+        <w:t xml:space="preserve">for c in </w:t>
+      </w:r>
+      <w:proofErr w:type="gramStart"/>
       <w:r>
         <w:rPr>
           <w:rFonts w:ascii="Courier New" w:eastAsia="Times New Roman" w:hAnsi="Courier New" w:cs="Courier New"/>
@@ -6596,9 +6872,9 @@
           <w:sz w:val="19"/>
           <w:szCs w:val="19"/>
         </w:rPr>
-        <w:br/>
-        <w:t>random.shuffle(positions)</w:t>
-      </w:r>
+        <w:t>range(</w:t>
+      </w:r>
+      <w:proofErr w:type="gramEnd"/>
       <w:r>
         <w:rPr>
           <w:rFonts w:ascii="Courier New" w:eastAsia="Times New Roman" w:hAnsi="Courier New" w:cs="Courier New"/>
@@ -6606,7 +6882,7 @@
           <w:sz w:val="19"/>
           <w:szCs w:val="19"/>
         </w:rPr>
-        <w:br/>
+        <w:t>9):</w:t>
       </w:r>
       <w:r>
         <w:rPr>
@@ -6616,8 +6892,8 @@
           <w:szCs w:val="19"/>
         </w:rPr>
         <w:br/>
-        <w:t>for r, c in positions[:remove]:</w:t>
-      </w:r>
+      </w:r>
+      <w:proofErr w:type="gramStart"/>
       <w:r>
         <w:rPr>
           <w:rFonts w:ascii="Courier New" w:eastAsia="Times New Roman" w:hAnsi="Courier New" w:cs="Courier New"/>
@@ -6625,6 +6901,102 @@
           <w:sz w:val="19"/>
           <w:szCs w:val="19"/>
         </w:rPr>
+        <w:t>positions.append</w:t>
+      </w:r>
+      <w:proofErr w:type="gramEnd"/>
+      <w:r>
+        <w:rPr>
+          <w:rFonts w:ascii="Courier New" w:eastAsia="Times New Roman" w:hAnsi="Courier New" w:cs="Courier New"/>
+          <w:color w:val="000000"/>
+          <w:sz w:val="19"/>
+          <w:szCs w:val="19"/>
+        </w:rPr>
+        <w:t>((r, c))</w:t>
+      </w:r>
+      <w:r>
+        <w:rPr>
+          <w:rFonts w:ascii="Courier New" w:eastAsia="Times New Roman" w:hAnsi="Courier New" w:cs="Courier New"/>
+          <w:color w:val="000000"/>
+          <w:sz w:val="19"/>
+          <w:szCs w:val="19"/>
+        </w:rPr>
+        <w:br/>
+      </w:r>
+      <w:r>
+        <w:rPr>
+          <w:rFonts w:ascii="Courier New" w:eastAsia="Times New Roman" w:hAnsi="Courier New" w:cs="Courier New"/>
+          <w:color w:val="000000"/>
+          <w:sz w:val="19"/>
+          <w:szCs w:val="19"/>
+        </w:rPr>
+        <w:br/>
+      </w:r>
+      <w:proofErr w:type="gramStart"/>
+      <w:r>
+        <w:rPr>
+          <w:rFonts w:ascii="Courier New" w:eastAsia="Times New Roman" w:hAnsi="Courier New" w:cs="Courier New"/>
+          <w:color w:val="000000"/>
+          <w:sz w:val="19"/>
+          <w:szCs w:val="19"/>
+        </w:rPr>
+        <w:t>random.shuffle</w:t>
+      </w:r>
+      <w:proofErr w:type="gramEnd"/>
+      <w:r>
+        <w:rPr>
+          <w:rFonts w:ascii="Courier New" w:eastAsia="Times New Roman" w:hAnsi="Courier New" w:cs="Courier New"/>
+          <w:color w:val="000000"/>
+          <w:sz w:val="19"/>
+          <w:szCs w:val="19"/>
+        </w:rPr>
+        <w:t>(positions)</w:t>
+      </w:r>
+      <w:r>
+        <w:rPr>
+          <w:rFonts w:ascii="Courier New" w:eastAsia="Times New Roman" w:hAnsi="Courier New" w:cs="Courier New"/>
+          <w:color w:val="000000"/>
+          <w:sz w:val="19"/>
+          <w:szCs w:val="19"/>
+        </w:rPr>
+        <w:br/>
+      </w:r>
+      <w:r>
+        <w:rPr>
+          <w:rFonts w:ascii="Courier New" w:eastAsia="Times New Roman" w:hAnsi="Courier New" w:cs="Courier New"/>
+          <w:color w:val="000000"/>
+          <w:sz w:val="19"/>
+          <w:szCs w:val="19"/>
+        </w:rPr>
+        <w:br/>
+        <w:t>for r, c in positions</w:t>
+      </w:r>
+      <w:proofErr w:type="gramStart"/>
+      <w:r>
+        <w:rPr>
+          <w:rFonts w:ascii="Courier New" w:eastAsia="Times New Roman" w:hAnsi="Courier New" w:cs="Courier New"/>
+          <w:color w:val="000000"/>
+          <w:sz w:val="19"/>
+          <w:szCs w:val="19"/>
+        </w:rPr>
+        <w:t>[:remove</w:t>
+      </w:r>
+      <w:proofErr w:type="gramEnd"/>
+      <w:r>
+        <w:rPr>
+          <w:rFonts w:ascii="Courier New" w:eastAsia="Times New Roman" w:hAnsi="Courier New" w:cs="Courier New"/>
+          <w:color w:val="000000"/>
+          <w:sz w:val="19"/>
+          <w:szCs w:val="19"/>
+        </w:rPr>
+        <w:t>]:</w:t>
+      </w:r>
+      <w:r>
+        <w:rPr>
+          <w:rFonts w:ascii="Courier New" w:eastAsia="Times New Roman" w:hAnsi="Courier New" w:cs="Courier New"/>
+          <w:color w:val="000000"/>
+          <w:sz w:val="19"/>
+          <w:szCs w:val="19"/>
+        </w:rPr>
         <w:br/>
         <w:t>board[r][c] = 0</w:t>
       </w:r>
@@ -6649,6 +7021,7 @@
           <w:color w:val="000000"/>
           <w:sz w:val="26"/>
           <w:szCs w:val="26"/>
+          <w:lang w:val="vi-VN"/>
         </w:rPr>
       </w:pPr>
       <w:r>
@@ -6657,6 +7030,7 @@
           <w:color w:val="000000"/>
           <w:sz w:val="26"/>
           <w:szCs w:val="26"/>
+          <w:lang w:val="vi-VN"/>
         </w:rPr>
         <w:t>Danh sách positions có tổng cộng 81 vị trí. random.shuffle(positions) xáo trộn các vị trí. Sau đó positions[:remove] lấy đúng số lượng vị trí cần xóa. Các ô này được đặt về 0.</w:t>
       </w:r>
@@ -6678,6 +7052,7 @@
           <w:color w:val="000000"/>
           <w:sz w:val="26"/>
           <w:szCs w:val="26"/>
+          <w:lang w:val="vi-VN"/>
         </w:rPr>
         <w:t>Cách sinh này giúp các vị trí trống thay đổi qua mỗi lần chạy. Vì vậy người dùng có thể nhận được các đề khác nhau thay vì chỉ một đề cố định.</w:t>
       </w:r>
@@ -6702,6 +7077,7 @@
           <w:color w:val="000000"/>
           <w:sz w:val="26"/>
           <w:szCs w:val="26"/>
+          <w:lang w:val="vi-VN"/>
         </w:rPr>
       </w:pPr>
       <w:r>
@@ -6710,6 +7086,7 @@
           <w:color w:val="000000"/>
           <w:sz w:val="26"/>
           <w:szCs w:val="26"/>
+          <w:lang w:val="vi-VN"/>
         </w:rPr>
         <w:t>Theo code hiện tại, số lượng ô được giữ lại và xóa như sau:</w:t>
       </w:r>
@@ -7329,7 +7706,27 @@
           <w:szCs w:val="26"/>
         </w:rPr>
         <w:lastRenderedPageBreak/>
-        <w:t>Code hiện tại thực hiện việc kiểm tra theo hướng tìm lời giải: chương trình tạo bản sao của đề bằng solution = [row[:] for row in sudoku], sau đó gọi backtracking(solution). Nếu Backtracking trả về True thì solution đã trở thành một bàn Sudoku hoàn chỉnh.</w:t>
+        <w:t>Code hiện tại thực hiện việc kiểm tra theo hướng tìm lời giải: chương trình tạo bản sao của đề bằng solution = [</w:t>
+      </w:r>
+      <w:proofErr w:type="gramStart"/>
+      <w:r>
+        <w:rPr>
+          <w:rFonts w:ascii="Times New Roman" w:eastAsia="Times New Roman" w:hAnsi="Times New Roman" w:cs="Times New Roman"/>
+          <w:color w:val="000000"/>
+          <w:sz w:val="26"/>
+          <w:szCs w:val="26"/>
+        </w:rPr>
+        <w:t>row[</w:t>
+      </w:r>
+      <w:proofErr w:type="gramEnd"/>
+      <w:r>
+        <w:rPr>
+          <w:rFonts w:ascii="Times New Roman" w:eastAsia="Times New Roman" w:hAnsi="Times New Roman" w:cs="Times New Roman"/>
+          <w:color w:val="000000"/>
+          <w:sz w:val="26"/>
+          <w:szCs w:val="26"/>
+        </w:rPr>
+        <w:t>:] for row in sudoku], sau đó gọi backtracking(solution). Nếu Backtracking trả về True thì solution đã trở thành một bàn Sudoku hoàn chỉnh.</w:t>
       </w:r>
     </w:p>
     <w:p>
@@ -7362,8 +7759,9 @@
           <w:sz w:val="19"/>
           <w:szCs w:val="19"/>
         </w:rPr>
-        <w:t>solution = [row[:] for row in sudoku]</w:t>
-      </w:r>
+        <w:t>solution = [</w:t>
+      </w:r>
+      <w:proofErr w:type="gramStart"/>
       <w:r>
         <w:rPr>
           <w:rFonts w:ascii="Courier New" w:eastAsia="Times New Roman" w:hAnsi="Courier New" w:cs="Courier New"/>
@@ -7371,8 +7769,9 @@
           <w:sz w:val="19"/>
           <w:szCs w:val="19"/>
         </w:rPr>
-        <w:br/>
-      </w:r>
+        <w:t>row[</w:t>
+      </w:r>
+      <w:proofErr w:type="gramEnd"/>
       <w:r>
         <w:rPr>
           <w:rFonts w:ascii="Courier New" w:eastAsia="Times New Roman" w:hAnsi="Courier New" w:cs="Courier New"/>
@@ -7380,6 +7779,24 @@
           <w:sz w:val="19"/>
           <w:szCs w:val="19"/>
         </w:rPr>
+        <w:t>:] for row in sudoku]</w:t>
+      </w:r>
+      <w:r>
+        <w:rPr>
+          <w:rFonts w:ascii="Courier New" w:eastAsia="Times New Roman" w:hAnsi="Courier New" w:cs="Courier New"/>
+          <w:color w:val="000000"/>
+          <w:sz w:val="19"/>
+          <w:szCs w:val="19"/>
+        </w:rPr>
+        <w:br/>
+      </w:r>
+      <w:r>
+        <w:rPr>
+          <w:rFonts w:ascii="Courier New" w:eastAsia="Times New Roman" w:hAnsi="Courier New" w:cs="Courier New"/>
+          <w:color w:val="000000"/>
+          <w:sz w:val="19"/>
+          <w:szCs w:val="19"/>
+        </w:rPr>
         <w:br/>
         <w:t>backtracking(solution)</w:t>
       </w:r>
@@ -7400,8 +7817,8 @@
           <w:szCs w:val="19"/>
         </w:rPr>
         <w:br/>
-        <w:t>print("\nLoi giai:")</w:t>
-      </w:r>
+      </w:r>
+      <w:proofErr w:type="gramStart"/>
       <w:r>
         <w:rPr>
           <w:rFonts w:ascii="Courier New" w:eastAsia="Times New Roman" w:hAnsi="Courier New" w:cs="Courier New"/>
@@ -7409,6 +7826,25 @@
           <w:sz w:val="19"/>
           <w:szCs w:val="19"/>
         </w:rPr>
+        <w:t>print(</w:t>
+      </w:r>
+      <w:proofErr w:type="gramEnd"/>
+      <w:r>
+        <w:rPr>
+          <w:rFonts w:ascii="Courier New" w:eastAsia="Times New Roman" w:hAnsi="Courier New" w:cs="Courier New"/>
+          <w:color w:val="000000"/>
+          <w:sz w:val="19"/>
+          <w:szCs w:val="19"/>
+        </w:rPr>
+        <w:t>"\nLoi giai:")</w:t>
+      </w:r>
+      <w:r>
+        <w:rPr>
+          <w:rFonts w:ascii="Courier New" w:eastAsia="Times New Roman" w:hAnsi="Courier New" w:cs="Courier New"/>
+          <w:color w:val="000000"/>
+          <w:sz w:val="19"/>
+          <w:szCs w:val="19"/>
+        </w:rPr>
         <w:br/>
         <w:t>print_board(solution)</w:t>
       </w:r>
@@ -7433,6 +7869,7 @@
           <w:color w:val="000000"/>
           <w:sz w:val="26"/>
           <w:szCs w:val="26"/>
+          <w:lang w:val="vi-VN"/>
         </w:rPr>
       </w:pPr>
       <w:r>
@@ -7451,6 +7888,7 @@
           <w:color w:val="000000"/>
           <w:sz w:val="26"/>
           <w:szCs w:val="26"/>
+          <w:lang w:val="vi-VN"/>
         </w:rPr>
         <w:t>hức năng này là 'kiểm tra khả năng hoàn thành và tạo lời giải' thay vì khẳng định chương trình đã có chức năng kiểm tra người chơi thắng hay thua.</w:t>
       </w:r>
@@ -7463,6 +7901,7 @@
           <w:color w:val="000000"/>
           <w:sz w:val="26"/>
           <w:szCs w:val="26"/>
+          <w:lang w:val="vi-VN"/>
         </w:rPr>
       </w:pPr>
       <w:r>
@@ -7471,6 +7910,7 @@
           <w:color w:val="000000"/>
           <w:sz w:val="26"/>
           <w:szCs w:val="26"/>
+          <w:lang w:val="vi-VN"/>
         </w:rPr>
         <w:t>Một chương trình Sudoku hoàn chỉnh có thể phát triển thêm hàm kiểm tra chiến thắng. Hàm này sẽ kiểm tra xem bàn cờ người chơi nhập vào có đủ 81 ô, không còn ô 0 và tất cả hàng, cột, khối 3×3 đều hợp lệ hay không. Tuy nhiên phần đó chưa nằm trong code hiện tại.</w:t>
       </w:r>
@@ -7479,6 +7919,7 @@
       <w:pPr>
         <w:rPr>
           <w:rFonts w:ascii="Times New Roman" w:eastAsia="Times New Roman" w:hAnsi="Times New Roman" w:cs="Times New Roman"/>
+          <w:lang w:val="vi-VN"/>
         </w:rPr>
       </w:pPr>
     </w:p>
@@ -7492,6 +7933,7 @@
         <w:rPr>
           <w:sz w:val="26"/>
           <w:szCs w:val="26"/>
+          <w:lang w:val="vi-VN"/>
         </w:rPr>
       </w:pPr>
     </w:p>
@@ -7550,7 +7992,25 @@
           <w:sz w:val="26"/>
           <w:szCs w:val="26"/>
         </w:rPr>
-        <w:t>Trong thực tế, chương trình không thử tất cả các tổ hợp. Hàm valid() loại bỏ ngay những số vi phạm hàng, cột hoặc khối 3×3. Vì vậy rất nhiều nhánh không hợp lệ được loại bỏ sớm.</w:t>
+        <w:t xml:space="preserve">Trong thực tế, chương trình không thử tất cả các tổ hợp. Hàm </w:t>
+      </w:r>
+      <w:proofErr w:type="gramStart"/>
+      <w:r>
+        <w:rPr>
+          <w:color w:val="000000"/>
+          <w:sz w:val="26"/>
+          <w:szCs w:val="26"/>
+        </w:rPr>
+        <w:t>valid(</w:t>
+      </w:r>
+      <w:proofErr w:type="gramEnd"/>
+      <w:r>
+        <w:rPr>
+          <w:color w:val="000000"/>
+          <w:sz w:val="26"/>
+          <w:szCs w:val="26"/>
+        </w:rPr>
+        <w:t>) loại bỏ ngay những số vi phạm hàng, cột hoặc khối 3×3. Vì vậy rất nhiều nhánh không hợp lệ được loại bỏ sớm.</w:t>
       </w:r>
     </w:p>
     <w:p>
@@ -7570,7 +8030,25 @@
           <w:sz w:val="26"/>
           <w:szCs w:val="26"/>
         </w:rPr>
-        <w:t>Khi dùng Backtracking để tạo bàn hoàn chỉnh từ bảng rỗng, số lần thử phụ thuộc vào thứ tự các số. Do chương trình sử dụng random.shuffle(), mỗi lần chạy có thể có số lần quay lui khác nhau.</w:t>
+        <w:t xml:space="preserve">Khi dùng Backtracking để tạo bàn hoàn chỉnh từ bảng rỗng, số lần thử phụ thuộc vào thứ tự các số. Do chương trình sử dụng </w:t>
+      </w:r>
+      <w:proofErr w:type="gramStart"/>
+      <w:r>
+        <w:rPr>
+          <w:color w:val="000000"/>
+          <w:sz w:val="26"/>
+          <w:szCs w:val="26"/>
+        </w:rPr>
+        <w:t>random.shuffle</w:t>
+      </w:r>
+      <w:proofErr w:type="gramEnd"/>
+      <w:r>
+        <w:rPr>
+          <w:color w:val="000000"/>
+          <w:sz w:val="26"/>
+          <w:szCs w:val="26"/>
+        </w:rPr>
+        <w:t>(), mỗi lần chạy có thể có số lần quay lui khác nhau.</w:t>
       </w:r>
     </w:p>
     <w:p>
@@ -7590,7 +8068,43 @@
           <w:sz w:val="26"/>
           <w:szCs w:val="26"/>
         </w:rPr>
-        <w:t>Đối với hàm generate_sudoku(), việc tạo danh sách 81 vị trí và xáo trộn có độ phức tạp khoảng O(81), tức là hằng số đối với Sudoku 9×9. Phần tốn thời gian chính vẫn là Backtracking.</w:t>
+        <w:t>Đối với hàm generate_</w:t>
+      </w:r>
+      <w:proofErr w:type="gramStart"/>
+      <w:r>
+        <w:rPr>
+          <w:color w:val="000000"/>
+          <w:sz w:val="26"/>
+          <w:szCs w:val="26"/>
+        </w:rPr>
+        <w:t>sudoku(</w:t>
+      </w:r>
+      <w:proofErr w:type="gramEnd"/>
+      <w:r>
+        <w:rPr>
+          <w:color w:val="000000"/>
+          <w:sz w:val="26"/>
+          <w:szCs w:val="26"/>
+        </w:rPr>
+        <w:t xml:space="preserve">), việc tạo danh sách 81 vị trí và xáo trộn có độ phức tạp khoảng </w:t>
+      </w:r>
+      <w:proofErr w:type="gramStart"/>
+      <w:r>
+        <w:rPr>
+          <w:color w:val="000000"/>
+          <w:sz w:val="26"/>
+          <w:szCs w:val="26"/>
+        </w:rPr>
+        <w:t>O(</w:t>
+      </w:r>
+      <w:proofErr w:type="gramEnd"/>
+      <w:r>
+        <w:rPr>
+          <w:color w:val="000000"/>
+          <w:sz w:val="26"/>
+          <w:szCs w:val="26"/>
+        </w:rPr>
+        <w:t>81), tức là hằng số đối với Sudoku 9×9. Phần tốn thời gian chính vẫn là Backtracking.</w:t>
       </w:r>
     </w:p>
     <w:p>
@@ -7661,7 +8175,43 @@
           <w:sz w:val="26"/>
           <w:szCs w:val="26"/>
         </w:rPr>
-        <w:t>Phần code Sudoku được xây dựng dựa trên thuật toán Backtracking kết hợp với kiểm tra ràng buộc. Hàm valid() đảm bảo số được thử không vi phạm các điều kiện của Sudoku. Hàm backtracking() thực hiện quá trình thử số, đệ quy và quay lui để tạo hoặc tìm lời giải.</w:t>
+        <w:t xml:space="preserve">Phần code Sudoku được xây dựng dựa trên thuật toán Backtracking kết hợp với kiểm tra ràng buộc. Hàm </w:t>
+      </w:r>
+      <w:proofErr w:type="gramStart"/>
+      <w:r>
+        <w:rPr>
+          <w:color w:val="000000"/>
+          <w:sz w:val="26"/>
+          <w:szCs w:val="26"/>
+        </w:rPr>
+        <w:t>valid(</w:t>
+      </w:r>
+      <w:proofErr w:type="gramEnd"/>
+      <w:r>
+        <w:rPr>
+          <w:color w:val="000000"/>
+          <w:sz w:val="26"/>
+          <w:szCs w:val="26"/>
+        </w:rPr>
+        <w:t xml:space="preserve">) đảm bảo số được thử không vi phạm các điều kiện của Sudoku. Hàm </w:t>
+      </w:r>
+      <w:proofErr w:type="gramStart"/>
+      <w:r>
+        <w:rPr>
+          <w:color w:val="000000"/>
+          <w:sz w:val="26"/>
+          <w:szCs w:val="26"/>
+        </w:rPr>
+        <w:t>backtracking(</w:t>
+      </w:r>
+      <w:proofErr w:type="gramEnd"/>
+      <w:r>
+        <w:rPr>
+          <w:color w:val="000000"/>
+          <w:sz w:val="26"/>
+          <w:szCs w:val="26"/>
+        </w:rPr>
+        <w:t>) thực hiện quá trình thử số, đệ quy và quay lui để tạo hoặc tìm lời giải.</w:t>
       </w:r>
     </w:p>
     <w:p>
@@ -7683,7 +8233,43 @@
           <w:szCs w:val="26"/>
         </w:rPr>
         <w:lastRenderedPageBreak/>
-        <w:t>Hàm generate_sudoku() sử dụng Backtracking để tạo một bàn hoàn chỉnh trước, sau đó xóa các ô ngẫu nhiên theo ba mức độ Dễ, Vừa và Khó. Hàm print_board() giúp hiển thị bàn Sudoku trên Terminal một cách trực quan.</w:t>
+        <w:t>Hàm generate_</w:t>
+      </w:r>
+      <w:proofErr w:type="gramStart"/>
+      <w:r>
+        <w:rPr>
+          <w:color w:val="000000"/>
+          <w:sz w:val="26"/>
+          <w:szCs w:val="26"/>
+        </w:rPr>
+        <w:t>sudoku(</w:t>
+      </w:r>
+      <w:proofErr w:type="gramEnd"/>
+      <w:r>
+        <w:rPr>
+          <w:color w:val="000000"/>
+          <w:sz w:val="26"/>
+          <w:szCs w:val="26"/>
+        </w:rPr>
+        <w:t>) sử dụng Backtracking để tạo một bàn hoàn chỉnh trước, sau đó xóa các ô ngẫu nhiên theo ba mức độ Dễ, Vừa và Khó. Hàm print_</w:t>
+      </w:r>
+      <w:proofErr w:type="gramStart"/>
+      <w:r>
+        <w:rPr>
+          <w:color w:val="000000"/>
+          <w:sz w:val="26"/>
+          <w:szCs w:val="26"/>
+        </w:rPr>
+        <w:t>board(</w:t>
+      </w:r>
+      <w:proofErr w:type="gramEnd"/>
+      <w:r>
+        <w:rPr>
+          <w:color w:val="000000"/>
+          <w:sz w:val="26"/>
+          <w:szCs w:val="26"/>
+        </w:rPr>
+        <w:t>) giúp hiển thị bàn Sudoku trên Terminal một cách trực quan.</w:t>
       </w:r>
     </w:p>
     <w:p>
@@ -8421,7 +9007,25 @@
           <w:sz w:val="26"/>
           <w:szCs w:val="26"/>
         </w:rPr>
-        <w:t>Nhóm sử dụng giao thức TCP Socket. Lý do:</w:t>
+        <w:t xml:space="preserve">Nhóm sử dụng giao thức TCP Socket. Lý </w:t>
+      </w:r>
+      <w:proofErr w:type="gramStart"/>
+      <w:r>
+        <w:rPr>
+          <w:color w:val="000000"/>
+          <w:sz w:val="26"/>
+          <w:szCs w:val="26"/>
+        </w:rPr>
+        <w:t>do</w:t>
+      </w:r>
+      <w:proofErr w:type="gramEnd"/>
+      <w:r>
+        <w:rPr>
+          <w:color w:val="000000"/>
+          <w:sz w:val="26"/>
+          <w:szCs w:val="26"/>
+        </w:rPr>
+        <w:t>:</w:t>
       </w:r>
     </w:p>
     <w:p>
@@ -10471,8 +11075,20 @@
           <w:szCs w:val="26"/>
           <w:lang w:val="fr-FR"/>
         </w:rPr>
-        <w:t>Các thông tin cần đồng bộ gồm:</w:t>
-      </w:r>
+        <w:t xml:space="preserve">Các thông tin cần đồng bộ </w:t>
+      </w:r>
+      <w:proofErr w:type="gramStart"/>
+      <w:r>
+        <w:rPr>
+          <w:rFonts w:ascii="Times New Roman" w:hAnsi="Times New Roman" w:cs="Times New Roman"/>
+          <w:color w:val="000000"/>
+          <w:sz w:val="26"/>
+          <w:szCs w:val="26"/>
+          <w:lang w:val="fr-FR"/>
+        </w:rPr>
+        <w:t>gồm:</w:t>
+      </w:r>
+      <w:proofErr w:type="gramEnd"/>
     </w:p>
     <w:p>
       <w:pPr>
@@ -13174,6 +13790,16 @@
     </w:p>
     <w:p>
       <w:pPr>
+        <w:ind w:left="720"/>
+        <w:rPr>
+          <w:rFonts w:ascii="Times New Roman" w:hAnsi="Times New Roman" w:cs="Times New Roman"/>
+          <w:sz w:val="26"/>
+          <w:szCs w:val="26"/>
+        </w:rPr>
+      </w:pPr>
+    </w:p>
+    <w:p>
+      <w:pPr>
         <w:pStyle w:val="Heading3"/>
         <w:rPr>
           <w:sz w:val="26"/>
@@ -13221,13 +13847,12 @@
       <w:r>
         <w:rPr>
           <w:noProof/>
-          <w:lang w:bidi="en-US"/>
         </w:rPr>
         <w:drawing>
-          <wp:inline distT="0" distB="0" distL="0" distR="0" wp14:anchorId="546FFEFE" wp14:editId="1330CCE9">
-            <wp:extent cx="4000044" cy="2788920"/>
-            <wp:effectExtent l="0" t="0" r="635" b="0"/>
-            <wp:docPr id="549331486" name="Picture 1"/>
+          <wp:inline distT="0" distB="0" distL="0" distR="0" wp14:anchorId="1418713A" wp14:editId="5D787D7B">
+            <wp:extent cx="5737860" cy="4079028"/>
+            <wp:effectExtent l="0" t="0" r="0" b="0"/>
+            <wp:docPr id="435085076" name="Picture 1"/>
             <wp:cNvGraphicFramePr>
               <a:graphicFrameLocks xmlns:a="http://schemas.openxmlformats.org/drawingml/2006/main" noChangeAspect="1"/>
             </wp:cNvGraphicFramePr>
@@ -13235,7 +13860,7 @@
               <a:graphicData uri="http://schemas.openxmlformats.org/drawingml/2006/picture">
                 <pic:pic xmlns:pic="http://schemas.openxmlformats.org/drawingml/2006/picture">
                   <pic:nvPicPr>
-                    <pic:cNvPr id="549331486" name=""/>
+                    <pic:cNvPr id="435085076" name=""/>
                     <pic:cNvPicPr/>
                   </pic:nvPicPr>
                   <pic:blipFill>
@@ -13247,7 +13872,7 @@
                   <pic:spPr>
                     <a:xfrm>
                       <a:off x="0" y="0"/>
-                      <a:ext cx="4003213" cy="2791130"/>
+                      <a:ext cx="5798678" cy="4122263"/>
                     </a:xfrm>
                     <a:prstGeom prst="rect">
                       <a:avLst/>
@@ -13284,20 +13909,22 @@
         <w:pStyle w:val="NormalWeb"/>
         <w:numPr>
           <w:ilvl w:val="0"/>
-          <w:numId w:val="23"/>
+          <w:numId w:val="30"/>
         </w:numPr>
         <w:spacing w:before="0" w:beforeAutospacing="0" w:after="160" w:afterAutospacing="0"/>
         <w:rPr>
           <w:sz w:val="26"/>
           <w:szCs w:val="26"/>
-        </w:rPr>
-      </w:pPr>
-      <w:r>
-        <w:rPr>
-          <w:sz w:val="26"/>
-          <w:szCs w:val="26"/>
-        </w:rPr>
-        <w:t>Banner thương hiệu lớn "SUDOKU ĐỐI KHÁNG".</w:t>
+          <w:lang w:val="vi-VN"/>
+        </w:rPr>
+      </w:pPr>
+      <w:r>
+        <w:rPr>
+          <w:sz w:val="26"/>
+          <w:szCs w:val="26"/>
+          <w:lang w:val="vi-VN"/>
+        </w:rPr>
+        <w:t>Banner thương hiệu lớn "SUDOKU ĐỐI KHÁNG" kèm dòng mô tả phụ "Đăng nhập để bắt đầu".</w:t>
       </w:r>
     </w:p>
     <w:p>
@@ -13305,20 +13932,22 @@
         <w:pStyle w:val="NormalWeb"/>
         <w:numPr>
           <w:ilvl w:val="0"/>
-          <w:numId w:val="23"/>
+          <w:numId w:val="30"/>
         </w:numPr>
         <w:spacing w:before="0" w:beforeAutospacing="0" w:after="160" w:afterAutospacing="0"/>
         <w:rPr>
           <w:sz w:val="26"/>
           <w:szCs w:val="26"/>
-        </w:rPr>
-      </w:pPr>
-      <w:r>
-        <w:rPr>
-          <w:sz w:val="26"/>
-          <w:szCs w:val="26"/>
-        </w:rPr>
-        <w:t>Khung nhập liệu Tên người chơi (Username Entry) với thiết kế bo gọn trên nền CARD2.</w:t>
+          <w:lang w:val="vi-VN"/>
+        </w:rPr>
+      </w:pPr>
+      <w:r>
+        <w:rPr>
+          <w:sz w:val="26"/>
+          <w:szCs w:val="26"/>
+          <w:lang w:val="vi-VN"/>
+        </w:rPr>
+        <w:t>Khung nhập liệu Tên người chơi (Username Entry) trên nền tối CARD2.</w:t>
       </w:r>
     </w:p>
     <w:p>
@@ -13326,37 +13955,219 @@
         <w:pStyle w:val="NormalWeb"/>
         <w:numPr>
           <w:ilvl w:val="0"/>
-          <w:numId w:val="23"/>
+          <w:numId w:val="30"/>
         </w:numPr>
         <w:spacing w:before="0" w:beforeAutospacing="0" w:after="160" w:afterAutospacing="0"/>
         <w:rPr>
           <w:sz w:val="26"/>
           <w:szCs w:val="26"/>
-        </w:rPr>
-      </w:pPr>
-      <w:r>
-        <w:rPr>
-          <w:sz w:val="26"/>
-          <w:szCs w:val="26"/>
-        </w:rPr>
-        <w:t>Nút bấm "ĐĂNG NHẬP" màu Cyan nổi bật.</w:t>
+          <w:lang w:val="vi-VN"/>
+        </w:rPr>
+      </w:pPr>
+      <w:r>
+        <w:rPr>
+          <w:sz w:val="26"/>
+          <w:szCs w:val="26"/>
+          <w:lang w:val="vi-VN"/>
+        </w:rPr>
+        <w:t>Khung nhập liệu Mật khẩu (Password Entry) có tính năng ẩn ký tự bảo mật, tích hợp nút biểu tượng con mắt (Eye Button) để bật/tắt hiển thị mật khẩu.</w:t>
       </w:r>
     </w:p>
     <w:p>
       <w:pPr>
         <w:pStyle w:val="NormalWeb"/>
+        <w:numPr>
+          <w:ilvl w:val="0"/>
+          <w:numId w:val="30"/>
+        </w:numPr>
         <w:spacing w:before="0" w:beforeAutospacing="0" w:after="160" w:afterAutospacing="0"/>
         <w:rPr>
           <w:sz w:val="26"/>
           <w:szCs w:val="26"/>
-        </w:rPr>
-      </w:pPr>
-      <w:r>
-        <w:rPr>
-          <w:sz w:val="26"/>
-          <w:szCs w:val="26"/>
-        </w:rPr>
-        <w:t>Phản hồi giao diện: Kiểm tra chuỗi rỗng; nếu người dùng chưa nhập tên, hệ thống hiển thị thông báo cảnh báo "Vui lòng nhập tên!" qua hộp thoại thông báo.</w:t>
+          <w:lang w:val="vi-VN"/>
+        </w:rPr>
+      </w:pPr>
+      <w:r>
+        <w:rPr>
+          <w:sz w:val="26"/>
+          <w:szCs w:val="26"/>
+          <w:lang w:val="vi-VN"/>
+        </w:rPr>
+        <w:t>Hộp kiểm "Lưu mật khẩu" (Checkbutton) cho phép ghi nhớ trạng thái đăng nhập.</w:t>
+      </w:r>
+    </w:p>
+    <w:p>
+      <w:pPr>
+        <w:pStyle w:val="NormalWeb"/>
+        <w:numPr>
+          <w:ilvl w:val="0"/>
+          <w:numId w:val="30"/>
+        </w:numPr>
+        <w:spacing w:before="0" w:beforeAutospacing="0" w:after="160" w:afterAutospacing="0"/>
+        <w:rPr>
+          <w:sz w:val="26"/>
+          <w:szCs w:val="26"/>
+          <w:lang w:val="vi-VN"/>
+        </w:rPr>
+      </w:pPr>
+      <w:r>
+        <w:rPr>
+          <w:sz w:val="26"/>
+          <w:szCs w:val="26"/>
+          <w:lang w:val="vi-VN"/>
+        </w:rPr>
+        <w:t>Nút liên kết phụ "Quên mật khẩu?" hỗ trợ người dùng khi cần trợ giúp tài khoản.</w:t>
+      </w:r>
+    </w:p>
+    <w:p>
+      <w:pPr>
+        <w:pStyle w:val="NormalWeb"/>
+        <w:numPr>
+          <w:ilvl w:val="0"/>
+          <w:numId w:val="30"/>
+        </w:numPr>
+        <w:spacing w:before="0" w:beforeAutospacing="0" w:after="160" w:afterAutospacing="0"/>
+        <w:rPr>
+          <w:sz w:val="26"/>
+          <w:szCs w:val="26"/>
+          <w:lang w:val="vi-VN"/>
+        </w:rPr>
+      </w:pPr>
+      <w:r>
+        <w:rPr>
+          <w:sz w:val="26"/>
+          <w:szCs w:val="26"/>
+          <w:lang w:val="vi-VN"/>
+        </w:rPr>
+        <w:t>Nút bấm "ĐĂNG NHẬP" kích thước lớn với tông màu xanh Cyan (PRIMARY) nổi bật, có hiệu ứng hover tương tác.</w:t>
+      </w:r>
+    </w:p>
+    <w:p>
+      <w:pPr>
+        <w:pStyle w:val="NormalWeb"/>
+        <w:spacing w:after="160"/>
+        <w:rPr>
+          <w:sz w:val="26"/>
+          <w:szCs w:val="26"/>
+          <w:lang w:val="vi-VN"/>
+        </w:rPr>
+      </w:pPr>
+      <w:r>
+        <w:rPr>
+          <w:sz w:val="26"/>
+          <w:szCs w:val="26"/>
+          <w:lang w:val="vi-VN"/>
+        </w:rPr>
+        <w:t>Phản hồi giao diện:</w:t>
+      </w:r>
+      <w:r>
+        <w:rPr>
+          <w:sz w:val="26"/>
+          <w:szCs w:val="26"/>
+          <w:lang w:val="vi-VN"/>
+        </w:rPr>
+        <w:t xml:space="preserve"> </w:t>
+      </w:r>
+      <w:r>
+        <w:rPr>
+          <w:sz w:val="26"/>
+          <w:szCs w:val="26"/>
+          <w:lang w:val="vi-VN"/>
+        </w:rPr>
+        <w:t>Kiểm tra tính hợp lệ của dữ liệu đầu vào (Validation):</w:t>
+      </w:r>
+    </w:p>
+    <w:p>
+      <w:pPr>
+        <w:pStyle w:val="NormalWeb"/>
+        <w:numPr>
+          <w:ilvl w:val="1"/>
+          <w:numId w:val="31"/>
+        </w:numPr>
+        <w:spacing w:before="0" w:beforeAutospacing="0" w:after="160" w:afterAutospacing="0"/>
+        <w:rPr>
+          <w:sz w:val="26"/>
+          <w:szCs w:val="26"/>
+          <w:lang w:val="vi-VN"/>
+        </w:rPr>
+      </w:pPr>
+      <w:r>
+        <w:rPr>
+          <w:sz w:val="26"/>
+          <w:szCs w:val="26"/>
+          <w:lang w:val="vi-VN"/>
+        </w:rPr>
+        <w:t>Nếu chưa nhập Tên người chơi: Hệ thống hiển thị hộp thoại cảnh báo messagebox.showwarning với nội dung "Vui lòng nhập tên người chơi!".</w:t>
+      </w:r>
+    </w:p>
+    <w:p>
+      <w:pPr>
+        <w:pStyle w:val="NormalWeb"/>
+        <w:numPr>
+          <w:ilvl w:val="1"/>
+          <w:numId w:val="31"/>
+        </w:numPr>
+        <w:spacing w:before="0" w:beforeAutospacing="0" w:after="160" w:afterAutospacing="0"/>
+        <w:rPr>
+          <w:sz w:val="26"/>
+          <w:szCs w:val="26"/>
+          <w:lang w:val="vi-VN"/>
+        </w:rPr>
+      </w:pPr>
+      <w:r>
+        <w:rPr>
+          <w:sz w:val="26"/>
+          <w:szCs w:val="26"/>
+          <w:lang w:val="vi-VN"/>
+        </w:rPr>
+        <w:lastRenderedPageBreak/>
+        <w:t>Nếu chưa nhập Mật khẩu: Hệ thống hiển thị hộp thoại cảnh báo "Vui lòng nhập mật khẩu!".</w:t>
+      </w:r>
+    </w:p>
+    <w:p>
+      <w:pPr>
+        <w:pStyle w:val="NormalWeb"/>
+        <w:numPr>
+          <w:ilvl w:val="1"/>
+          <w:numId w:val="31"/>
+        </w:numPr>
+        <w:spacing w:before="0" w:beforeAutospacing="0" w:after="160" w:afterAutospacing="0"/>
+        <w:rPr>
+          <w:sz w:val="26"/>
+          <w:szCs w:val="26"/>
+          <w:lang w:val="vi-VN"/>
+        </w:rPr>
+      </w:pPr>
+      <w:r>
+        <w:rPr>
+          <w:sz w:val="26"/>
+          <w:szCs w:val="26"/>
+          <w:lang w:val="vi-VN"/>
+        </w:rPr>
+        <w:t>Khi thông tin hợp lệ: Hiển thị hộp thoại thông báo messagebox.showinfo "Đăng nhập thành công!" kèm tên người chơi và chuyển tiếp sang màn hình sảnh chờ (Lobby).</w:t>
+      </w:r>
+    </w:p>
+    <w:p>
+      <w:pPr>
+        <w:pStyle w:val="NormalWeb"/>
+        <w:numPr>
+          <w:ilvl w:val="1"/>
+          <w:numId w:val="31"/>
+        </w:numPr>
+        <w:spacing w:before="0" w:beforeAutospacing="0" w:after="160" w:afterAutospacing="0"/>
+        <w:rPr>
+          <w:sz w:val="26"/>
+          <w:szCs w:val="26"/>
+          <w:lang w:val="vi-VN"/>
+        </w:rPr>
+      </w:pPr>
+      <w:r>
+        <w:rPr>
+          <w:sz w:val="26"/>
+          <w:szCs w:val="26"/>
+          <w:lang w:val="vi-VN"/>
+        </w:rPr>
+        <w:t>Khi nhấn "Quên mật khẩu?": Hiển thị hộp thoại hướng dẫn liên hệ quản trị viên.</w:t>
       </w:r>
     </w:p>
     <w:p>
@@ -13393,9 +14204,9 @@
           <w:lang w:bidi="en-US"/>
         </w:rPr>
         <w:drawing>
-          <wp:inline distT="0" distB="0" distL="0" distR="0" wp14:anchorId="5278C1E3" wp14:editId="2A0AF663">
-            <wp:extent cx="4425839" cy="2910840"/>
-            <wp:effectExtent l="0" t="0" r="0" b="3810"/>
+          <wp:inline distT="0" distB="0" distL="0" distR="0" wp14:anchorId="5278C1E3" wp14:editId="5216918A">
+            <wp:extent cx="6128977" cy="4030980"/>
+            <wp:effectExtent l="0" t="0" r="5715" b="7620"/>
             <wp:docPr id="1440128507" name="Picture 1"/>
             <wp:cNvGraphicFramePr>
               <a:graphicFrameLocks xmlns:a="http://schemas.openxmlformats.org/drawingml/2006/main" noChangeAspect="1"/>
@@ -13416,7 +14227,7 @@
                   <pic:spPr>
                     <a:xfrm>
                       <a:off x="0" y="0"/>
-                      <a:ext cx="4440726" cy="2920631"/>
+                      <a:ext cx="6172806" cy="4059806"/>
                     </a:xfrm>
                     <a:prstGeom prst="rect">
                       <a:avLst/>
@@ -13445,7 +14256,6 @@
           <w:sz w:val="26"/>
           <w:szCs w:val="26"/>
         </w:rPr>
-        <w:lastRenderedPageBreak/>
         <w:t>Thành phần UI:</w:t>
       </w:r>
     </w:p>
@@ -13528,6 +14338,7 @@
           <w:iCs w:val="0"/>
           <w:szCs w:val="26"/>
         </w:rPr>
+        <w:lastRenderedPageBreak/>
         <w:t>Màn</w:t>
       </w:r>
       <w:r>
@@ -13578,9 +14389,9 @@
           <w:szCs w:val="26"/>
         </w:rPr>
         <w:drawing>
-          <wp:inline distT="0" distB="0" distL="0" distR="0" wp14:anchorId="15075D84" wp14:editId="53F92813">
-            <wp:extent cx="3953273" cy="2750820"/>
-            <wp:effectExtent l="0" t="0" r="9525" b="0"/>
+          <wp:inline distT="0" distB="0" distL="0" distR="0" wp14:anchorId="15075D84" wp14:editId="3ABB8494">
+            <wp:extent cx="5037411" cy="3505200"/>
+            <wp:effectExtent l="0" t="0" r="0" b="0"/>
             <wp:docPr id="1202733211" name="Picture 1"/>
             <wp:cNvGraphicFramePr>
               <a:graphicFrameLocks xmlns:a="http://schemas.openxmlformats.org/drawingml/2006/main" noChangeAspect="1"/>
@@ -13601,7 +14412,7 @@
                   <pic:spPr>
                     <a:xfrm>
                       <a:off x="0" y="0"/>
-                      <a:ext cx="3976615" cy="2767062"/>
+                      <a:ext cx="5079120" cy="3534222"/>
                     </a:xfrm>
                     <a:prstGeom prst="rect">
                       <a:avLst/>
@@ -13660,9 +14471,9 @@
           <w:szCs w:val="26"/>
         </w:rPr>
         <w:drawing>
-          <wp:inline distT="0" distB="0" distL="0" distR="0" wp14:anchorId="7CEB275F" wp14:editId="78D3F6A0">
-            <wp:extent cx="3923820" cy="2712720"/>
-            <wp:effectExtent l="0" t="0" r="635" b="0"/>
+          <wp:inline distT="0" distB="0" distL="0" distR="0" wp14:anchorId="7CEB275F" wp14:editId="343D810D">
+            <wp:extent cx="5036820" cy="3482190"/>
+            <wp:effectExtent l="0" t="0" r="0" b="4445"/>
             <wp:docPr id="1202801531" name="Picture 1"/>
             <wp:cNvGraphicFramePr>
               <a:graphicFrameLocks xmlns:a="http://schemas.openxmlformats.org/drawingml/2006/main" noChangeAspect="1"/>
@@ -13683,7 +14494,7 @@
                   <pic:spPr>
                     <a:xfrm>
                       <a:off x="0" y="0"/>
-                      <a:ext cx="3960095" cy="2737799"/>
+                      <a:ext cx="5106453" cy="3530331"/>
                     </a:xfrm>
                     <a:prstGeom prst="rect">
                       <a:avLst/>
@@ -18142,6 +18953,155 @@
     </w:lvl>
   </w:abstractNum>
   <w:abstractNum w:abstractNumId="26" w15:restartNumberingAfterBreak="0">
+    <w:nsid w:val="75202FF9"/>
+    <w:multiLevelType w:val="multilevel"/>
+    <w:tmpl w:val="2116B53A"/>
+    <w:lvl w:ilvl="0">
+      <w:start w:val="1"/>
+      <w:numFmt w:val="bullet"/>
+      <w:lvlText w:val=""/>
+      <w:lvlJc w:val="left"/>
+      <w:pPr>
+        <w:tabs>
+          <w:tab w:val="num" w:pos="720"/>
+        </w:tabs>
+        <w:ind w:left="720" w:hanging="360"/>
+      </w:pPr>
+      <w:rPr>
+        <w:rFonts w:ascii="Symbol" w:hAnsi="Symbol" w:hint="default"/>
+        <w:sz w:val="20"/>
+      </w:rPr>
+    </w:lvl>
+    <w:lvl w:ilvl="1">
+      <w:start w:val="1"/>
+      <w:numFmt w:val="bullet"/>
+      <w:lvlText w:val=""/>
+      <w:lvlJc w:val="left"/>
+      <w:pPr>
+        <w:tabs>
+          <w:tab w:val="num" w:pos="1440"/>
+        </w:tabs>
+        <w:ind w:left="1440" w:hanging="360"/>
+      </w:pPr>
+      <w:rPr>
+        <w:rFonts w:ascii="Symbol" w:hAnsi="Symbol" w:hint="default"/>
+        <w:sz w:val="20"/>
+      </w:rPr>
+    </w:lvl>
+    <w:lvl w:ilvl="2" w:tentative="1">
+      <w:start w:val="1"/>
+      <w:numFmt w:val="bullet"/>
+      <w:lvlText w:val=""/>
+      <w:lvlJc w:val="left"/>
+      <w:pPr>
+        <w:tabs>
+          <w:tab w:val="num" w:pos="2160"/>
+        </w:tabs>
+        <w:ind w:left="2160" w:hanging="360"/>
+      </w:pPr>
+      <w:rPr>
+        <w:rFonts w:ascii="Symbol" w:hAnsi="Symbol" w:hint="default"/>
+        <w:sz w:val="20"/>
+      </w:rPr>
+    </w:lvl>
+    <w:lvl w:ilvl="3" w:tentative="1">
+      <w:start w:val="1"/>
+      <w:numFmt w:val="bullet"/>
+      <w:lvlText w:val=""/>
+      <w:lvlJc w:val="left"/>
+      <w:pPr>
+        <w:tabs>
+          <w:tab w:val="num" w:pos="2880"/>
+        </w:tabs>
+        <w:ind w:left="2880" w:hanging="360"/>
+      </w:pPr>
+      <w:rPr>
+        <w:rFonts w:ascii="Symbol" w:hAnsi="Symbol" w:hint="default"/>
+        <w:sz w:val="20"/>
+      </w:rPr>
+    </w:lvl>
+    <w:lvl w:ilvl="4" w:tentative="1">
+      <w:start w:val="1"/>
+      <w:numFmt w:val="bullet"/>
+      <w:lvlText w:val=""/>
+      <w:lvlJc w:val="left"/>
+      <w:pPr>
+        <w:tabs>
+          <w:tab w:val="num" w:pos="3600"/>
+        </w:tabs>
+        <w:ind w:left="3600" w:hanging="360"/>
+      </w:pPr>
+      <w:rPr>
+        <w:rFonts w:ascii="Symbol" w:hAnsi="Symbol" w:hint="default"/>
+        <w:sz w:val="20"/>
+      </w:rPr>
+    </w:lvl>
+    <w:lvl w:ilvl="5" w:tentative="1">
+      <w:start w:val="1"/>
+      <w:numFmt w:val="bullet"/>
+      <w:lvlText w:val=""/>
+      <w:lvlJc w:val="left"/>
+      <w:pPr>
+        <w:tabs>
+          <w:tab w:val="num" w:pos="4320"/>
+        </w:tabs>
+        <w:ind w:left="4320" w:hanging="360"/>
+      </w:pPr>
+      <w:rPr>
+        <w:rFonts w:ascii="Symbol" w:hAnsi="Symbol" w:hint="default"/>
+        <w:sz w:val="20"/>
+      </w:rPr>
+    </w:lvl>
+    <w:lvl w:ilvl="6" w:tentative="1">
+      <w:start w:val="1"/>
+      <w:numFmt w:val="bullet"/>
+      <w:lvlText w:val=""/>
+      <w:lvlJc w:val="left"/>
+      <w:pPr>
+        <w:tabs>
+          <w:tab w:val="num" w:pos="5040"/>
+        </w:tabs>
+        <w:ind w:left="5040" w:hanging="360"/>
+      </w:pPr>
+      <w:rPr>
+        <w:rFonts w:ascii="Symbol" w:hAnsi="Symbol" w:hint="default"/>
+        <w:sz w:val="20"/>
+      </w:rPr>
+    </w:lvl>
+    <w:lvl w:ilvl="7" w:tentative="1">
+      <w:start w:val="1"/>
+      <w:numFmt w:val="bullet"/>
+      <w:lvlText w:val=""/>
+      <w:lvlJc w:val="left"/>
+      <w:pPr>
+        <w:tabs>
+          <w:tab w:val="num" w:pos="5760"/>
+        </w:tabs>
+        <w:ind w:left="5760" w:hanging="360"/>
+      </w:pPr>
+      <w:rPr>
+        <w:rFonts w:ascii="Symbol" w:hAnsi="Symbol" w:hint="default"/>
+        <w:sz w:val="20"/>
+      </w:rPr>
+    </w:lvl>
+    <w:lvl w:ilvl="8" w:tentative="1">
+      <w:start w:val="1"/>
+      <w:numFmt w:val="bullet"/>
+      <w:lvlText w:val=""/>
+      <w:lvlJc w:val="left"/>
+      <w:pPr>
+        <w:tabs>
+          <w:tab w:val="num" w:pos="6480"/>
+        </w:tabs>
+        <w:ind w:left="6480" w:hanging="360"/>
+      </w:pPr>
+      <w:rPr>
+        <w:rFonts w:ascii="Symbol" w:hAnsi="Symbol" w:hint="default"/>
+        <w:sz w:val="20"/>
+      </w:rPr>
+    </w:lvl>
+  </w:abstractNum>
+  <w:abstractNum w:abstractNumId="27" w15:restartNumberingAfterBreak="0">
     <w:nsid w:val="76B021AA"/>
     <w:multiLevelType w:val="multilevel"/>
     <w:tmpl w:val="5A7A7C12"/>
@@ -18290,7 +19250,7 @@
       </w:rPr>
     </w:lvl>
   </w:abstractNum>
-  <w:abstractNum w:abstractNumId="27" w15:restartNumberingAfterBreak="0">
+  <w:abstractNum w:abstractNumId="28" w15:restartNumberingAfterBreak="0">
     <w:nsid w:val="78616D79"/>
     <w:multiLevelType w:val="hybridMultilevel"/>
     <w:tmpl w:val="3258A9B6"/>
@@ -18403,7 +19363,156 @@
       </w:rPr>
     </w:lvl>
   </w:abstractNum>
-  <w:abstractNum w:abstractNumId="28" w15:restartNumberingAfterBreak="0">
+  <w:abstractNum w:abstractNumId="29" w15:restartNumberingAfterBreak="0">
+    <w:nsid w:val="79A035F9"/>
+    <w:multiLevelType w:val="multilevel"/>
+    <w:tmpl w:val="A132918E"/>
+    <w:lvl w:ilvl="0">
+      <w:start w:val="1"/>
+      <w:numFmt w:val="bullet"/>
+      <w:lvlText w:val=""/>
+      <w:lvlJc w:val="left"/>
+      <w:pPr>
+        <w:tabs>
+          <w:tab w:val="num" w:pos="720"/>
+        </w:tabs>
+        <w:ind w:left="720" w:hanging="360"/>
+      </w:pPr>
+      <w:rPr>
+        <w:rFonts w:ascii="Symbol" w:hAnsi="Symbol" w:hint="default"/>
+        <w:sz w:val="20"/>
+      </w:rPr>
+    </w:lvl>
+    <w:lvl w:ilvl="1" w:tentative="1">
+      <w:start w:val="1"/>
+      <w:numFmt w:val="bullet"/>
+      <w:lvlText w:val=""/>
+      <w:lvlJc w:val="left"/>
+      <w:pPr>
+        <w:tabs>
+          <w:tab w:val="num" w:pos="1440"/>
+        </w:tabs>
+        <w:ind w:left="1440" w:hanging="360"/>
+      </w:pPr>
+      <w:rPr>
+        <w:rFonts w:ascii="Symbol" w:hAnsi="Symbol" w:hint="default"/>
+        <w:sz w:val="20"/>
+      </w:rPr>
+    </w:lvl>
+    <w:lvl w:ilvl="2" w:tentative="1">
+      <w:start w:val="1"/>
+      <w:numFmt w:val="bullet"/>
+      <w:lvlText w:val=""/>
+      <w:lvlJc w:val="left"/>
+      <w:pPr>
+        <w:tabs>
+          <w:tab w:val="num" w:pos="2160"/>
+        </w:tabs>
+        <w:ind w:left="2160" w:hanging="360"/>
+      </w:pPr>
+      <w:rPr>
+        <w:rFonts w:ascii="Symbol" w:hAnsi="Symbol" w:hint="default"/>
+        <w:sz w:val="20"/>
+      </w:rPr>
+    </w:lvl>
+    <w:lvl w:ilvl="3" w:tentative="1">
+      <w:start w:val="1"/>
+      <w:numFmt w:val="bullet"/>
+      <w:lvlText w:val=""/>
+      <w:lvlJc w:val="left"/>
+      <w:pPr>
+        <w:tabs>
+          <w:tab w:val="num" w:pos="2880"/>
+        </w:tabs>
+        <w:ind w:left="2880" w:hanging="360"/>
+      </w:pPr>
+      <w:rPr>
+        <w:rFonts w:ascii="Symbol" w:hAnsi="Symbol" w:hint="default"/>
+        <w:sz w:val="20"/>
+      </w:rPr>
+    </w:lvl>
+    <w:lvl w:ilvl="4" w:tentative="1">
+      <w:start w:val="1"/>
+      <w:numFmt w:val="bullet"/>
+      <w:lvlText w:val=""/>
+      <w:lvlJc w:val="left"/>
+      <w:pPr>
+        <w:tabs>
+          <w:tab w:val="num" w:pos="3600"/>
+        </w:tabs>
+        <w:ind w:left="3600" w:hanging="360"/>
+      </w:pPr>
+      <w:rPr>
+        <w:rFonts w:ascii="Symbol" w:hAnsi="Symbol" w:hint="default"/>
+        <w:sz w:val="20"/>
+      </w:rPr>
+    </w:lvl>
+    <w:lvl w:ilvl="5" w:tentative="1">
+      <w:start w:val="1"/>
+      <w:numFmt w:val="bullet"/>
+      <w:lvlText w:val=""/>
+      <w:lvlJc w:val="left"/>
+      <w:pPr>
+        <w:tabs>
+          <w:tab w:val="num" w:pos="4320"/>
+        </w:tabs>
+        <w:ind w:left="4320" w:hanging="360"/>
+      </w:pPr>
+      <w:rPr>
+        <w:rFonts w:ascii="Symbol" w:hAnsi="Symbol" w:hint="default"/>
+        <w:sz w:val="20"/>
+      </w:rPr>
+    </w:lvl>
+    <w:lvl w:ilvl="6" w:tentative="1">
+      <w:start w:val="1"/>
+      <w:numFmt w:val="bullet"/>
+      <w:lvlText w:val=""/>
+      <w:lvlJc w:val="left"/>
+      <w:pPr>
+        <w:tabs>
+          <w:tab w:val="num" w:pos="5040"/>
+        </w:tabs>
+        <w:ind w:left="5040" w:hanging="360"/>
+      </w:pPr>
+      <w:rPr>
+        <w:rFonts w:ascii="Symbol" w:hAnsi="Symbol" w:hint="default"/>
+        <w:sz w:val="20"/>
+      </w:rPr>
+    </w:lvl>
+    <w:lvl w:ilvl="7" w:tentative="1">
+      <w:start w:val="1"/>
+      <w:numFmt w:val="bullet"/>
+      <w:lvlText w:val=""/>
+      <w:lvlJc w:val="left"/>
+      <w:pPr>
+        <w:tabs>
+          <w:tab w:val="num" w:pos="5760"/>
+        </w:tabs>
+        <w:ind w:left="5760" w:hanging="360"/>
+      </w:pPr>
+      <w:rPr>
+        <w:rFonts w:ascii="Symbol" w:hAnsi="Symbol" w:hint="default"/>
+        <w:sz w:val="20"/>
+      </w:rPr>
+    </w:lvl>
+    <w:lvl w:ilvl="8" w:tentative="1">
+      <w:start w:val="1"/>
+      <w:numFmt w:val="bullet"/>
+      <w:lvlText w:val=""/>
+      <w:lvlJc w:val="left"/>
+      <w:pPr>
+        <w:tabs>
+          <w:tab w:val="num" w:pos="6480"/>
+        </w:tabs>
+        <w:ind w:left="6480" w:hanging="360"/>
+      </w:pPr>
+      <w:rPr>
+        <w:rFonts w:ascii="Symbol" w:hAnsi="Symbol" w:hint="default"/>
+        <w:sz w:val="20"/>
+      </w:rPr>
+    </w:lvl>
+  </w:abstractNum>
+  <w:abstractNum w:abstractNumId="30" w15:restartNumberingAfterBreak="0">
     <w:nsid w:val="7DAC0CCF"/>
     <w:multiLevelType w:val="hybridMultilevel"/>
     <w:tmpl w:val="472A8E1A"/>
@@ -18553,7 +19662,7 @@
     <w:abstractNumId w:val="24"/>
   </w:num>
   <w:num w:numId="13" w16cid:durableId="691105171">
-    <w:abstractNumId w:val="26"/>
+    <w:abstractNumId w:val="27"/>
   </w:num>
   <w:num w:numId="14" w16cid:durableId="1691176332">
     <w:abstractNumId w:val="4"/>
@@ -18577,7 +19686,7 @@
     <w:abstractNumId w:val="14"/>
   </w:num>
   <w:num w:numId="21" w16cid:durableId="1164471259">
-    <w:abstractNumId w:val="28"/>
+    <w:abstractNumId w:val="30"/>
   </w:num>
   <w:num w:numId="22" w16cid:durableId="2076196582">
     <w:abstractNumId w:val="18"/>
@@ -18589,7 +19698,7 @@
     <w:abstractNumId w:val="6"/>
   </w:num>
   <w:num w:numId="25" w16cid:durableId="616453308">
-    <w:abstractNumId w:val="27"/>
+    <w:abstractNumId w:val="28"/>
   </w:num>
   <w:num w:numId="26" w16cid:durableId="30156961">
     <w:abstractNumId w:val="25"/>
@@ -18602,6 +19711,12 @@
   </w:num>
   <w:num w:numId="29" w16cid:durableId="354574639">
     <w:abstractNumId w:val="3"/>
+  </w:num>
+  <w:num w:numId="30" w16cid:durableId="986201873">
+    <w:abstractNumId w:val="29"/>
+  </w:num>
+  <w:num w:numId="31" w16cid:durableId="2037926485">
+    <w:abstractNumId w:val="26"/>
   </w:num>
   <w:numIdMacAtCleanup w:val="29"/>
 </w:numbering>
@@ -19266,7 +20381,6 @@
   <w:style w:type="character" w:default="1" w:styleId="DefaultParagraphFont">
     <w:name w:val="Default Paragraph Font"/>
     <w:uiPriority w:val="1"/>
-    <w:semiHidden/>
     <w:unhideWhenUsed/>
   </w:style>
   <w:style w:type="table" w:default="1" w:styleId="TableNormal">

</xml_diff>